<commit_message>
fix: final-review pass (packager keeps Solver-saved workbook, rf sensitivity, honest Solver wording)
Co-Authored-By: Claude Sonnet 5.5 <noreply@anthropic.com>
</commit_message>
<xml_diff>
--- a/Prompts_and_Answers.docx
+++ b/Prompts_and_Answers.docx
@@ -2620,7 +2620,7 @@
         <w:pStyle w:val="ListBullet"/>
       </w:pPr>
       <w:r>
-        <w:t>Version 2 result: AGG forecast +4.4%; OCP = XLE 40.3%, QQQ 54.0%, GLD 61.1%, risk-free -55.4%; y = 1.554; expected return 26.4%, st. dev. 18.4%, Sharpe 1.285. An independent Python replica gives the same structure within about 2 points on every weight (y = 1.483, return 24.3%).</w:t>
+        <w:t>Version 2 result: AGG forecast +4.4%; OCP = XLE 40.3%, QQQ 54.0%, GLD 61.1%, risk-free -55.4%; y = 1.554; expected return 26.4%, st. dev. 18.4%, Sharpe 1.285. An independent Python replica gives the same structure within about 3 points on every weight (largest gap: GLD 61.1% vs 58.2%; y = 1.483, return 24.3%).</w:t>
       </w:r>
     </w:p>
     <w:p>
@@ -2636,7 +2636,7 @@
         <w:pStyle w:val="ListBullet"/>
       </w:pPr>
       <w:r>
-        <w:t>Every leave-one-out R-squared is negative (-0.02 to -0.05): the macro features show no out-of-sample skill on 48 observations. The ridge penalty shrinks forecasts back toward history, so the model is well-behaved rather than predictive.</w:t>
+        <w:t>Every leave-one-out R-squared is negative (-0.02 to -0.05): the macro features show no out-of-sample skill on 48 observations. The ridge penalty shrinks forecasts back toward history, so the model is well-behaved rather than predictive. Caution: the penalties are heavily shrunk (five of the ten sit at the 1000 edge of the grid), so a negative leave-one-out R-squared here mostly means 'no better than predicting each ETF's own mean'.</w:t>
       </w:r>
     </w:p>
     <w:p>
@@ -3930,6 +3930,24 @@
           <w:b/>
           <w:i w:val="0"/>
         </w:rPr>
+        <w:t>Risk-free rate convention</w:t>
+      </w:r>
+    </w:p>
+    <w:p>
+      <w:r>
+        <w:rPr>
+          <w:b w:val="0"/>
+          <w:i w:val="0"/>
+        </w:rPr>
+        <w:t>Both OCPs are built with the 2021-24 average risk-free rate (2.84%), the brief's single-rate convention, which keeps the two portfolios comparable. A forward-looking investor in December 2024 would face a higher rate (the 2024 average was 5.13%). Rerunning the Step 6 model's Python replica at 5.13% lowers the OCP's risky share from y = 1.48 to 1.21 and shifts the ORP weights by only a few points (XLE 27.5%, QQQ 38.1%, GLD 34.4%), keeping the same three ETFs. So the convention affects how much leverage 6b uses, not which assets it holds.</w:t>
+      </w:r>
+    </w:p>
+    <w:p>
+      <w:r>
+        <w:rPr>
+          <w:b/>
+          <w:i w:val="0"/>
+        </w:rPr>
         <w:t>Why we should not over-read this</w:t>
       </w:r>
     </w:p>
@@ -4066,7 +4084,7 @@
         <w:pStyle w:val="ListBullet"/>
       </w:pPr>
       <w:r>
-        <w:t>Estimation error (the central quantitative risk). With 48 observations the optimiser is fragile. Resampling the 48 months (bootstrap, 300 draws) moves the ORP weight on XLE between 3.9% and 84.4%, QQQ between 0.0% and 70.7%, and GLD between 0.0% and 69.8% (5th to 95th percentile); in 5.0% of draws the ORP collapses to a single ETF. By contrast, perturbing the covariance matrix by about 10% moves ORP weights by only about 3 percentage points, and a Ledoit-Wolf covariance gives almost the same ORP (XLE 39.4%, QQQ 24.2%, GLD 36.4%). The fragility therefore lies in the expected-return estimates, not the covariance matrix.</w:t>
+        <w:t>Estimation error (the central quantitative risk). With 48 observations the optimiser is fragile. Resampling the 48 months (bootstrap, 300 draws) moves the ORP weight on XLE between 3.9% and 84.4%, QQQ between 0.0% and 70.7%, and GLD between 0.0% and 69.8% (5th to 95th percentile); in 5.0% of draws the ORP collapses to a single ETF (and 5.0% of draws if a second ETF only counts once it holds at least 1%: the 1% threshold; the 2-ETF test in the code uses 0.01%, as in the brief's prompts). By contrast, perturbing the covariance matrix by about 10% moves ORP weights by only about 3 percentage points, and a Ledoit-Wolf covariance gives almost the same ORP (XLE 39.4%, QQQ 24.2%, GLD 36.4%). The fragility therefore lies in the expected-return estimates, not the covariance matrix.</w:t>
       </w:r>
     </w:p>
     <w:p>
@@ -4098,7 +4116,7 @@
         <w:pStyle w:val="ListBullet"/>
       </w:pPr>
       <w:r>
-        <w:t>Mitigations we used: independent Python and Excel Solver cross-checks; sanity asserts in the prompts; a 'no data after 2024-12-31' rule enforced in code; fresh-session reproduction of every prompt; repeat runs; mechanical number screening; and reporting uncertainty (bootstrap ranges) next to every recommendation.</w:t>
+        <w:t>Mitigations we used: independent Python and Excel-formula cross-checks (the Excel Solver run is to be confirmed by the team); sanity asserts in the prompts; a 'no data after 2024-12-31' rule enforced in code; fresh-session reproduction of every prompt; repeat runs; mechanical number screening; and reporting uncertainty (bootstrap ranges) next to every recommendation.</w:t>
       </w:r>
     </w:p>
     <w:p>

</xml_diff>